<commit_message>
Updated folder Structure and added LAB File for STM
</commit_message>
<xml_diff>
--- a/Embedded_AI/ClassNotes/Class_Notes_Embedded_AI.docx
+++ b/Embedded_AI/ClassNotes/Class_Notes_Embedded_AI.docx
@@ -25,7 +25,21 @@
         <w:rPr>
           <w:sz w:val="22"/>
         </w:rPr>
-        <w:t xml:space="preserve">The video content details Google’s recent announcement of its </w:t>
+        <w:t xml:space="preserve">The </w:t>
+      </w:r>
+      <w:proofErr w:type="gramStart"/>
+      <w:r>
+        <w:rPr>
+          <w:sz w:val="22"/>
+        </w:rPr>
+        <w:t>video content</w:t>
+      </w:r>
+      <w:proofErr w:type="gramEnd"/>
+      <w:r>
+        <w:rPr>
+          <w:sz w:val="22"/>
+        </w:rPr>
+        <w:t xml:space="preserve"> details Google’s recent announcement of its </w:t>
       </w:r>
       <w:r>
         <w:rPr>
@@ -269,7 +283,21 @@
         <w:rPr>
           <w:sz w:val="22"/>
         </w:rPr>
-        <w:t>. Google claims this can reduce frontier model training time from months to weeks.</w:t>
+        <w:t xml:space="preserve">. Google claims this can reduce frontier model training time from </w:t>
+      </w:r>
+      <w:proofErr w:type="gramStart"/>
+      <w:r>
+        <w:rPr>
+          <w:sz w:val="22"/>
+        </w:rPr>
+        <w:t>months</w:t>
+      </w:r>
+      <w:proofErr w:type="gramEnd"/>
+      <w:r>
+        <w:rPr>
+          <w:sz w:val="22"/>
+        </w:rPr>
+        <w:t xml:space="preserve"> to weeks.</w:t>
       </w:r>
     </w:p>
     <w:p>
@@ -395,19 +423,22 @@
           <w:sz w:val="22"/>
         </w:rPr>
       </w:pPr>
+      <w:proofErr w:type="spellStart"/>
       <w:r>
         <w:rPr>
           <w:sz w:val="22"/>
         </w:rPr>
         <w:t>LiteRT</w:t>
       </w:r>
-    </w:p>
-    <w:p>
-      <w:pPr>
-        <w:rPr>
-          <w:sz w:val="22"/>
-        </w:rPr>
-      </w:pPr>
+      <w:proofErr w:type="spellEnd"/>
+    </w:p>
+    <w:p>
+      <w:pPr>
+        <w:rPr>
+          <w:sz w:val="22"/>
+        </w:rPr>
+      </w:pPr>
+      <w:proofErr w:type="spellStart"/>
       <w:r>
         <w:rPr>
           <w:b/>
@@ -416,6 +447,7 @@
         </w:rPr>
         <w:t>LiteRT</w:t>
       </w:r>
+      <w:proofErr w:type="spellEnd"/>
       <w:r>
         <w:rPr>
           <w:sz w:val="22"/>
@@ -436,6 +468,7 @@
         </w:rPr>
         <w:t xml:space="preserve">) is Google’s high-performance framework for running machine learning and Generative AI models directly </w:t>
       </w:r>
+      <w:proofErr w:type="gramStart"/>
       <w:r>
         <w:rPr>
           <w:b/>
@@ -444,6 +477,7 @@
         </w:rPr>
         <w:t>on-device</w:t>
       </w:r>
+      <w:proofErr w:type="gramEnd"/>
       <w:r>
         <w:rPr>
           <w:sz w:val="22"/>
@@ -464,13 +498,41 @@
         <w:lastRenderedPageBreak/>
         <w:t xml:space="preserve">If the name sounds new but familiar, that is because </w:t>
       </w:r>
-      <w:r>
-        <w:rPr>
-          <w:b/>
-          <w:bCs/>
-          <w:sz w:val="22"/>
-        </w:rPr>
-        <w:t>LiteRT is the official, rebranded successor to TensorFlow Lite (TFLite)</w:t>
+      <w:proofErr w:type="spellStart"/>
+      <w:r>
+        <w:rPr>
+          <w:b/>
+          <w:bCs/>
+          <w:sz w:val="22"/>
+        </w:rPr>
+        <w:t>LiteRT</w:t>
+      </w:r>
+      <w:proofErr w:type="spellEnd"/>
+      <w:r>
+        <w:rPr>
+          <w:b/>
+          <w:bCs/>
+          <w:sz w:val="22"/>
+        </w:rPr>
+        <w:t xml:space="preserve"> is the official, rebranded successor to TensorFlow Lite (</w:t>
+      </w:r>
+      <w:proofErr w:type="spellStart"/>
+      <w:r>
+        <w:rPr>
+          <w:b/>
+          <w:bCs/>
+          <w:sz w:val="22"/>
+        </w:rPr>
+        <w:t>TFLite</w:t>
+      </w:r>
+      <w:proofErr w:type="spellEnd"/>
+      <w:r>
+        <w:rPr>
+          <w:b/>
+          <w:bCs/>
+          <w:sz w:val="22"/>
+        </w:rPr>
+        <w:t>)</w:t>
       </w:r>
       <w:r>
         <w:rPr>
@@ -489,7 +551,21 @@
         <w:rPr>
           <w:sz w:val="22"/>
         </w:rPr>
-        <w:t>Google updated the name to reflect an expanded vision: while the original framework was tied strictly to TensorFlow, LiteRT is a universal runtime built to seamlessly support multiple machine learning frameworks.</w:t>
+        <w:t xml:space="preserve">Google updated the name to reflect an expanded vision: while the original framework was tied strictly to TensorFlow, </w:t>
+      </w:r>
+      <w:proofErr w:type="spellStart"/>
+      <w:r>
+        <w:rPr>
+          <w:sz w:val="22"/>
+        </w:rPr>
+        <w:t>LiteRT</w:t>
+      </w:r>
+      <w:proofErr w:type="spellEnd"/>
+      <w:r>
+        <w:rPr>
+          <w:sz w:val="22"/>
+        </w:rPr>
+        <w:t xml:space="preserve"> is a universal runtime built to seamlessly support multiple machine learning frameworks.</w:t>
       </w:r>
     </w:p>
     <w:p>
@@ -521,8 +597,18 @@
           <w:bCs/>
           <w:sz w:val="22"/>
         </w:rPr>
-        <w:t>Key Features of LiteRT</w:t>
-      </w:r>
+        <w:t xml:space="preserve">Key Features of </w:t>
+      </w:r>
+      <w:proofErr w:type="spellStart"/>
+      <w:r>
+        <w:rPr>
+          <w:b/>
+          <w:bCs/>
+          <w:sz w:val="22"/>
+        </w:rPr>
+        <w:t>LiteRT</w:t>
+      </w:r>
+      <w:proofErr w:type="spellEnd"/>
     </w:p>
     <w:p>
       <w:pPr>
@@ -546,21 +632,107 @@
         <w:rPr>
           <w:sz w:val="22"/>
         </w:rPr>
-        <w:t xml:space="preserve"> You don't have to use TensorFlow anymore. LiteRT allows you to take models trained in </w:t>
-      </w:r>
-      <w:r>
-        <w:rPr>
-          <w:b/>
-          <w:bCs/>
-          <w:sz w:val="22"/>
-        </w:rPr>
-        <w:t>PyTorch, JAX, Keras, or TensorFlow</w:t>
-      </w:r>
-      <w:r>
-        <w:rPr>
-          <w:sz w:val="22"/>
-        </w:rPr>
-        <w:t xml:space="preserve"> and convert them into the highly efficient .tflite or .litertlm flat-buffer formats.</w:t>
+        <w:t xml:space="preserve"> You don't have to use TensorFlow anymore. </w:t>
+      </w:r>
+      <w:proofErr w:type="spellStart"/>
+      <w:r>
+        <w:rPr>
+          <w:sz w:val="22"/>
+        </w:rPr>
+        <w:t>LiteRT</w:t>
+      </w:r>
+      <w:proofErr w:type="spellEnd"/>
+      <w:r>
+        <w:rPr>
+          <w:sz w:val="22"/>
+        </w:rPr>
+        <w:t xml:space="preserve"> allows you to take models trained in </w:t>
+      </w:r>
+      <w:proofErr w:type="spellStart"/>
+      <w:r>
+        <w:rPr>
+          <w:b/>
+          <w:bCs/>
+          <w:sz w:val="22"/>
+        </w:rPr>
+        <w:t>PyTorch</w:t>
+      </w:r>
+      <w:proofErr w:type="spellEnd"/>
+      <w:r>
+        <w:rPr>
+          <w:b/>
+          <w:bCs/>
+          <w:sz w:val="22"/>
+        </w:rPr>
+        <w:t xml:space="preserve">, JAX, </w:t>
+      </w:r>
+      <w:proofErr w:type="spellStart"/>
+      <w:r>
+        <w:rPr>
+          <w:b/>
+          <w:bCs/>
+          <w:sz w:val="22"/>
+        </w:rPr>
+        <w:t>Keras</w:t>
+      </w:r>
+      <w:proofErr w:type="spellEnd"/>
+      <w:r>
+        <w:rPr>
+          <w:b/>
+          <w:bCs/>
+          <w:sz w:val="22"/>
+        </w:rPr>
+        <w:t>, or TensorFlow</w:t>
+      </w:r>
+      <w:r>
+        <w:rPr>
+          <w:sz w:val="22"/>
+        </w:rPr>
+        <w:t xml:space="preserve"> and convert them into the highly </w:t>
+      </w:r>
+      <w:proofErr w:type="gramStart"/>
+      <w:r>
+        <w:rPr>
+          <w:sz w:val="22"/>
+        </w:rPr>
+        <w:t>efficient .</w:t>
+      </w:r>
+      <w:proofErr w:type="spellStart"/>
+      <w:r>
+        <w:rPr>
+          <w:sz w:val="22"/>
+        </w:rPr>
+        <w:t>tflite</w:t>
+      </w:r>
+      <w:proofErr w:type="spellEnd"/>
+      <w:proofErr w:type="gramEnd"/>
+      <w:r>
+        <w:rPr>
+          <w:sz w:val="22"/>
+        </w:rPr>
+        <w:t xml:space="preserve"> </w:t>
+      </w:r>
+      <w:proofErr w:type="gramStart"/>
+      <w:r>
+        <w:rPr>
+          <w:sz w:val="22"/>
+        </w:rPr>
+        <w:t>or .</w:t>
+      </w:r>
+      <w:proofErr w:type="spellStart"/>
+      <w:r>
+        <w:rPr>
+          <w:sz w:val="22"/>
+        </w:rPr>
+        <w:t>litertlm</w:t>
+      </w:r>
+      <w:proofErr w:type="spellEnd"/>
+      <w:proofErr w:type="gramEnd"/>
+      <w:r>
+        <w:rPr>
+          <w:sz w:val="22"/>
+        </w:rPr>
+        <w:t xml:space="preserve"> flat-buffer formats.</w:t>
       </w:r>
     </w:p>
     <w:p>
@@ -638,15 +810,39 @@
         <w:rPr>
           <w:sz w:val="22"/>
         </w:rPr>
-        <w:t xml:space="preserve"> Alongside classic ML (like object detection and image segmentation), LiteRT features </w:t>
-      </w:r>
-      <w:r>
-        <w:rPr>
-          <w:b/>
-          <w:bCs/>
-          <w:sz w:val="22"/>
-        </w:rPr>
-        <w:t>LiteRT-LM</w:t>
+        <w:t xml:space="preserve"> Alongside classic ML (like object detection and image segmentation), </w:t>
+      </w:r>
+      <w:proofErr w:type="spellStart"/>
+      <w:r>
+        <w:rPr>
+          <w:sz w:val="22"/>
+        </w:rPr>
+        <w:t>LiteRT</w:t>
+      </w:r>
+      <w:proofErr w:type="spellEnd"/>
+      <w:r>
+        <w:rPr>
+          <w:sz w:val="22"/>
+        </w:rPr>
+        <w:t xml:space="preserve"> features </w:t>
+      </w:r>
+      <w:proofErr w:type="spellStart"/>
+      <w:r>
+        <w:rPr>
+          <w:b/>
+          <w:bCs/>
+          <w:sz w:val="22"/>
+        </w:rPr>
+        <w:t>LiteRT</w:t>
+      </w:r>
+      <w:proofErr w:type="spellEnd"/>
+      <w:r>
+        <w:rPr>
+          <w:b/>
+          <w:bCs/>
+          <w:sz w:val="22"/>
+        </w:rPr>
+        <w:t>-LM</w:t>
       </w:r>
       <w:r>
         <w:rPr>
@@ -707,15 +903,39 @@
         <w:rPr>
           <w:sz w:val="22"/>
         </w:rPr>
-        <w:t xml:space="preserve">Under the hood, LiteRT retains the core, battle-tested architecture that has powered billions of devices since 2017. The transition primarily streamlines APIs, introduces modern developer features like the </w:t>
-      </w:r>
-      <w:r>
-        <w:rPr>
-          <w:b/>
-          <w:bCs/>
-          <w:sz w:val="22"/>
-        </w:rPr>
-        <w:t>CompiledModel API</w:t>
+        <w:t xml:space="preserve">Under the hood, </w:t>
+      </w:r>
+      <w:proofErr w:type="spellStart"/>
+      <w:r>
+        <w:rPr>
+          <w:sz w:val="22"/>
+        </w:rPr>
+        <w:t>LiteRT</w:t>
+      </w:r>
+      <w:proofErr w:type="spellEnd"/>
+      <w:r>
+        <w:rPr>
+          <w:sz w:val="22"/>
+        </w:rPr>
+        <w:t xml:space="preserve"> retains the core, battle-tested architecture that has powered billions of devices since 2017. The transition primarily streamlines APIs, introduces modern developer features like the </w:t>
+      </w:r>
+      <w:proofErr w:type="spellStart"/>
+      <w:r>
+        <w:rPr>
+          <w:b/>
+          <w:bCs/>
+          <w:sz w:val="22"/>
+        </w:rPr>
+        <w:t>CompiledModel</w:t>
+      </w:r>
+      <w:proofErr w:type="spellEnd"/>
+      <w:r>
+        <w:rPr>
+          <w:b/>
+          <w:bCs/>
+          <w:sz w:val="22"/>
+        </w:rPr>
+        <w:t xml:space="preserve"> API</w:t>
       </w:r>
       <w:r>
         <w:rPr>
@@ -3229,44 +3449,38 @@
           <w:sz w:val="22"/>
         </w:rPr>
       </w:pPr>
-      <w:r>
-        <w:rPr>
-          <w:sz w:val="22"/>
-        </w:rPr>
-        <w:lastRenderedPageBreak/>
-        <w:t>Aravind,Samriddh,Pratik,Devesh, Jacob,Subodh, Nidhi W, Nidhi C,Navin, Niteesh, manasi, Sudipa,Albin,Shubankit,Akash,Ajay, Partmesh</w:t>
-      </w:r>
-      <w:r>
-        <w:rPr>
-          <w:sz w:val="22"/>
-        </w:rPr>
-        <w:t>,Navin, Yash, Suguna,Ajinkya,Abhijeet, Sadu,Jaydeep,Sandesh,Tejas, Sanjeevani, Suraj</w:t>
-      </w:r>
-    </w:p>
-    <w:p>
-      <w:pPr>
-        <w:rPr>
-          <w:sz w:val="22"/>
-        </w:rPr>
-      </w:pPr>
-    </w:p>
-    <w:p>
-      <w:pPr>
-        <w:rPr>
-          <w:sz w:val="22"/>
-        </w:rPr>
-      </w:pPr>
-      <w:r>
-        <w:rPr>
-          <w:sz w:val="22"/>
-        </w:rPr>
-        <w:t>Notes: 04/01/2026</w:t>
-      </w:r>
-      <w:r>
-        <w:rPr>
-          <w:sz w:val="22"/>
-        </w:rPr>
-        <w:t xml:space="preserve">  2.5Hrs</w:t>
+    </w:p>
+    <w:p>
+      <w:pPr>
+        <w:rPr>
+          <w:sz w:val="22"/>
+        </w:rPr>
+      </w:pPr>
+      <w:r>
+        <w:rPr>
+          <w:sz w:val="22"/>
+        </w:rPr>
+        <w:t>Notes: 04/01/</w:t>
+      </w:r>
+      <w:proofErr w:type="gramStart"/>
+      <w:r>
+        <w:rPr>
+          <w:sz w:val="22"/>
+        </w:rPr>
+        <w:t>2026</w:t>
+      </w:r>
+      <w:r>
+        <w:rPr>
+          <w:sz w:val="22"/>
+        </w:rPr>
+        <w:t xml:space="preserve">  2</w:t>
+      </w:r>
+      <w:proofErr w:type="gramEnd"/>
+      <w:r>
+        <w:rPr>
+          <w:sz w:val="22"/>
+        </w:rPr>
+        <w:t>.5Hrs</w:t>
       </w:r>
     </w:p>
     <w:p>
@@ -3676,14 +3890,7 @@
               <w:rPr>
                 <w:sz w:val="22"/>
               </w:rPr>
-              <w:t xml:space="preserve">. This </w:t>
-            </w:r>
-            <w:r>
-              <w:rPr>
-                <w:sz w:val="22"/>
-              </w:rPr>
-              <w:lastRenderedPageBreak/>
-              <w:t xml:space="preserve">usually leads to </w:t>
+              <w:t xml:space="preserve">. This usually leads to </w:t>
             </w:r>
             <w:r>
               <w:rPr>
@@ -3717,7 +3924,6 @@
               <w:rPr>
                 <w:sz w:val="22"/>
               </w:rPr>
-              <w:lastRenderedPageBreak/>
               <w:t xml:space="preserve">This method models the relationship between input variables (features) and continuous output variables, often framed as a </w:t>
             </w:r>
             <w:r>
@@ -3732,14 +3938,7 @@
               <w:rPr>
                 <w:sz w:val="22"/>
               </w:rPr>
-              <w:t xml:space="preserve">. Regression </w:t>
-            </w:r>
-            <w:r>
-              <w:rPr>
-                <w:sz w:val="22"/>
-              </w:rPr>
-              <w:lastRenderedPageBreak/>
-              <w:t>is used for tasks like filling missing data, filtering data, or predicting a numerical quantity (e.g., predicting the next hour's temperature).</w:t>
+              <w:t>. Regression is used for tasks like filling missing data, filtering data, or predicting a numerical quantity (e.g., predicting the next hour's temperature).</w:t>
             </w:r>
           </w:p>
         </w:tc>
@@ -4263,7 +4462,6 @@
         <w:rPr>
           <w:sz w:val="22"/>
         </w:rPr>
-        <w:lastRenderedPageBreak/>
         <w:t xml:space="preserve">What does a </w:t>
       </w:r>
       <w:r>
@@ -4305,6 +4503,12 @@
           <w:sz w:val="22"/>
         </w:rPr>
         <w:br/>
+      </w:r>
+      <w:r>
+        <w:rPr>
+          <w:sz w:val="22"/>
+        </w:rPr>
+        <w:lastRenderedPageBreak/>
         <w:t>C. Cluster centers of unlabeled data</w:t>
       </w:r>
       <w:r>
@@ -4903,11 +5107,19 @@
           <w:sz w:val="22"/>
         </w:rPr>
       </w:pPr>
-      <w:r>
-        <w:rPr>
-          <w:sz w:val="22"/>
-        </w:rPr>
-        <w:t>Notes : 21/01/2026</w:t>
+      <w:proofErr w:type="gramStart"/>
+      <w:r>
+        <w:rPr>
+          <w:sz w:val="22"/>
+        </w:rPr>
+        <w:t>Notes :</w:t>
+      </w:r>
+      <w:proofErr w:type="gramEnd"/>
+      <w:r>
+        <w:rPr>
+          <w:sz w:val="22"/>
+        </w:rPr>
+        <w:t xml:space="preserve"> 21/01/2026</w:t>
       </w:r>
     </w:p>
     <w:p>
@@ -5042,7 +5254,21 @@
         <w:rPr>
           <w:sz w:val="22"/>
         </w:rPr>
-        <w:t>Same notebook → Python testing → TFLite → STM32</w:t>
+        <w:t xml:space="preserve">Same notebook → Python testing → </w:t>
+      </w:r>
+      <w:proofErr w:type="spellStart"/>
+      <w:r>
+        <w:rPr>
+          <w:sz w:val="22"/>
+        </w:rPr>
+        <w:t>TFLite</w:t>
+      </w:r>
+      <w:proofErr w:type="spellEnd"/>
+      <w:r>
+        <w:rPr>
+          <w:sz w:val="22"/>
+        </w:rPr>
+        <w:t xml:space="preserve"> → STM32</w:t>
       </w:r>
     </w:p>
     <w:p>
@@ -5431,11 +5657,63 @@
           <w:sz w:val="22"/>
         </w:rPr>
       </w:pPr>
-      <w:r>
-        <w:rPr>
-          <w:sz w:val="22"/>
-        </w:rPr>
-        <w:t>set_tensor()        input_tensor-&gt;data.f[]</w:t>
+      <w:proofErr w:type="spellStart"/>
+      <w:r>
+        <w:rPr>
+          <w:sz w:val="22"/>
+        </w:rPr>
+        <w:t>set_</w:t>
+      </w:r>
+      <w:proofErr w:type="gramStart"/>
+      <w:r>
+        <w:rPr>
+          <w:sz w:val="22"/>
+        </w:rPr>
+        <w:t>tensor</w:t>
+      </w:r>
+      <w:proofErr w:type="spellEnd"/>
+      <w:r>
+        <w:rPr>
+          <w:sz w:val="22"/>
+        </w:rPr>
+        <w:t>(</w:t>
+      </w:r>
+      <w:proofErr w:type="gramEnd"/>
+      <w:r>
+        <w:rPr>
+          <w:sz w:val="22"/>
+        </w:rPr>
+        <w:t>)        </w:t>
+      </w:r>
+      <w:proofErr w:type="spellStart"/>
+      <w:r>
+        <w:rPr>
+          <w:sz w:val="22"/>
+        </w:rPr>
+        <w:t>input_tensor</w:t>
+      </w:r>
+      <w:proofErr w:type="spellEnd"/>
+      <w:r>
+        <w:rPr>
+          <w:sz w:val="22"/>
+        </w:rPr>
+        <w:t>-&gt;</w:t>
+      </w:r>
+      <w:proofErr w:type="spellStart"/>
+      <w:proofErr w:type="gramStart"/>
+      <w:r>
+        <w:rPr>
+          <w:sz w:val="22"/>
+        </w:rPr>
+        <w:t>data.f</w:t>
+      </w:r>
+      <w:proofErr w:type="spellEnd"/>
+      <w:proofErr w:type="gramEnd"/>
+      <w:r>
+        <w:rPr>
+          <w:sz w:val="22"/>
+        </w:rPr>
+        <w:t>[]</w:t>
       </w:r>
     </w:p>
     <w:p>
@@ -5445,11 +5723,41 @@
           <w:sz w:val="22"/>
         </w:rPr>
       </w:pPr>
-      <w:r>
-        <w:rPr>
-          <w:sz w:val="22"/>
-        </w:rPr>
-        <w:t>invoke()            TfLiteInvoke()</w:t>
+      <w:proofErr w:type="gramStart"/>
+      <w:r>
+        <w:rPr>
+          <w:sz w:val="22"/>
+        </w:rPr>
+        <w:t>invoke(</w:t>
+      </w:r>
+      <w:proofErr w:type="gramEnd"/>
+      <w:r>
+        <w:rPr>
+          <w:sz w:val="22"/>
+        </w:rPr>
+        <w:t>)            </w:t>
+      </w:r>
+      <w:proofErr w:type="spellStart"/>
+      <w:proofErr w:type="gramStart"/>
+      <w:r>
+        <w:rPr>
+          <w:sz w:val="22"/>
+        </w:rPr>
+        <w:t>TfLiteInvoke</w:t>
+      </w:r>
+      <w:proofErr w:type="spellEnd"/>
+      <w:r>
+        <w:rPr>
+          <w:sz w:val="22"/>
+        </w:rPr>
+        <w:t>(</w:t>
+      </w:r>
+      <w:proofErr w:type="gramEnd"/>
+      <w:r>
+        <w:rPr>
+          <w:sz w:val="22"/>
+        </w:rPr>
+        <w:t>)</w:t>
       </w:r>
     </w:p>
     <w:p>
@@ -5459,11 +5767,63 @@
           <w:sz w:val="22"/>
         </w:rPr>
       </w:pPr>
-      <w:r>
-        <w:rPr>
-          <w:sz w:val="22"/>
-        </w:rPr>
-        <w:t>get_tensor()        output_tensor-&gt;data.f[]</w:t>
+      <w:proofErr w:type="spellStart"/>
+      <w:r>
+        <w:rPr>
+          <w:sz w:val="22"/>
+        </w:rPr>
+        <w:t>get_</w:t>
+      </w:r>
+      <w:proofErr w:type="gramStart"/>
+      <w:r>
+        <w:rPr>
+          <w:sz w:val="22"/>
+        </w:rPr>
+        <w:t>tensor</w:t>
+      </w:r>
+      <w:proofErr w:type="spellEnd"/>
+      <w:r>
+        <w:rPr>
+          <w:sz w:val="22"/>
+        </w:rPr>
+        <w:t>(</w:t>
+      </w:r>
+      <w:proofErr w:type="gramEnd"/>
+      <w:r>
+        <w:rPr>
+          <w:sz w:val="22"/>
+        </w:rPr>
+        <w:t>)        </w:t>
+      </w:r>
+      <w:proofErr w:type="spellStart"/>
+      <w:r>
+        <w:rPr>
+          <w:sz w:val="22"/>
+        </w:rPr>
+        <w:t>output_tensor</w:t>
+      </w:r>
+      <w:proofErr w:type="spellEnd"/>
+      <w:r>
+        <w:rPr>
+          <w:sz w:val="22"/>
+        </w:rPr>
+        <w:t>-&gt;</w:t>
+      </w:r>
+      <w:proofErr w:type="spellStart"/>
+      <w:proofErr w:type="gramStart"/>
+      <w:r>
+        <w:rPr>
+          <w:sz w:val="22"/>
+        </w:rPr>
+        <w:t>data.f</w:t>
+      </w:r>
+      <w:proofErr w:type="spellEnd"/>
+      <w:proofErr w:type="gramEnd"/>
+      <w:r>
+        <w:rPr>
+          <w:sz w:val="22"/>
+        </w:rPr>
+        <w:t>[]</w:t>
       </w:r>
     </w:p>
     <w:p>

</xml_diff>